<commit_message>
docs: refresh baseline against source 464adef
</commit_message>
<xml_diff>
--- a/docs/official-baseline/v2026.07.28/00_ONSURE_설계정본_통합대장_v2026.07.28.docx
+++ b/docs/official-baseline/v2026.07.28/00_ONSURE_설계정본_통합대장_v2026.07.28.docx
@@ -31,9 +31,9 @@
       <w:r>
         <w:t>기준 브랜치: audit/onsure-meta-omission-remediation-20260728</w:t>
         <w:br/>
-        <w:t>기준 Commit: 81dfe0275f171b010c97648b58c17b8f745a3a50</w:t>
+        <w:t>기준 Commit: 464adefe585ac1f901b19aac974f443e964cca1d</w:t>
         <w:br/>
-        <w:t>생성시각: 2026-07-28T07:25:34-07:00</w:t>
+        <w:t>생성시각: 2026-07-28T07:30:32-07:00</w:t>
         <w:br/>
         <w:t>승인상태: BASELINE_CANDIDATE / NONFINAL / HOLD</w:t>
       </w:r>
@@ -1362,7 +1362,7 @@
                 <w:rFonts w:ascii="Malgun Gothic" w:hAnsi="Malgun Gothic" w:eastAsia="맑은 고딕"/>
                 <w:sz w:val="16"/>
               </w:rPr>
-              <w:t>0305b93672e9a6044eeceebc14ca3848a381cd34ebfeec2d31bf0d815c6dd399</w:t>
+              <w:t>5ea45623ecd3d2608d5fa8c768688a31a211d838a1faf4a61fd4156c3764f1d9</w:t>
             </w:r>
           </w:p>
         </w:tc>
@@ -1454,7 +1454,7 @@
                 <w:rFonts w:ascii="Malgun Gothic" w:hAnsi="Malgun Gothic" w:eastAsia="맑은 고딕"/>
                 <w:sz w:val="16"/>
               </w:rPr>
-              <w:t>563b50835a7b66b5122bdec3201efeadc84ed466216091a7a4d3ad68e73cad20</w:t>
+              <w:t>20845e5328943599775b958d426e78971e44593c730733c1328b3b40749ba631</w:t>
             </w:r>
           </w:p>
         </w:tc>
@@ -1546,7 +1546,7 @@
                 <w:rFonts w:ascii="Malgun Gothic" w:hAnsi="Malgun Gothic" w:eastAsia="맑은 고딕"/>
                 <w:sz w:val="16"/>
               </w:rPr>
-              <w:t>23556240bbd71b5c689575f37156c25b2dece4e79771f61968cd110b546204b2</w:t>
+              <w:t>b49e8807daae3a4462e245b8fc93f79fd4a598b2930698de87253ba36bdabc3d</w:t>
             </w:r>
           </w:p>
         </w:tc>
@@ -1638,7 +1638,7 @@
                 <w:rFonts w:ascii="Malgun Gothic" w:hAnsi="Malgun Gothic" w:eastAsia="맑은 고딕"/>
                 <w:sz w:val="16"/>
               </w:rPr>
-              <w:t>2af3bbd0b59d18fce319359f108c7a6d8e3905b356eb99589e5e68612fa82f69</w:t>
+              <w:t>57fafa5c04b7128d9d0a878f33c3f8e680353dd8f5be7770ec507d50e5127ec0</w:t>
             </w:r>
           </w:p>
         </w:tc>
@@ -1730,7 +1730,7 @@
                 <w:rFonts w:ascii="Malgun Gothic" w:hAnsi="Malgun Gothic" w:eastAsia="맑은 고딕"/>
                 <w:sz w:val="16"/>
               </w:rPr>
-              <w:t>5a18ff3e7bd4d6d3beb394df4514ef591952825b4e070d76e88a7dd75a603246</w:t>
+              <w:t>57cd869366935d19341b180f2cfaf570861929651e7d5e63796c5fd41802425b</w:t>
             </w:r>
           </w:p>
         </w:tc>
@@ -1822,7 +1822,7 @@
                 <w:rFonts w:ascii="Malgun Gothic" w:hAnsi="Malgun Gothic" w:eastAsia="맑은 고딕"/>
                 <w:sz w:val="16"/>
               </w:rPr>
-              <w:t>b3765ab0ee6caf44136a4458921e346e8dae27a78af3603b6c7a7e027d59b77b</w:t>
+              <w:t>f90514f860e3ca365f7ec3828fc07f49b90513d8cc64d536349cdaf747041177</w:t>
             </w:r>
           </w:p>
         </w:tc>
@@ -1914,7 +1914,7 @@
                 <w:rFonts w:ascii="Malgun Gothic" w:hAnsi="Malgun Gothic" w:eastAsia="맑은 고딕"/>
                 <w:sz w:val="16"/>
               </w:rPr>
-              <w:t>e3ed76e5f64ff66e66ecf25c5498fe4acbf97ce257a88273d6fc817720eed6bc</w:t>
+              <w:t>47196c00089d81f9b5c11be14398930054a73ef7c1ef3f527440efb85e13ae46</w:t>
             </w:r>
           </w:p>
         </w:tc>
@@ -2006,7 +2006,7 @@
                 <w:rFonts w:ascii="Malgun Gothic" w:hAnsi="Malgun Gothic" w:eastAsia="맑은 고딕"/>
                 <w:sz w:val="16"/>
               </w:rPr>
-              <w:t>f45e3695d9d1424db1aca98d45939bd97e35c4925d99bf0cc7f17944bdcff120</w:t>
+              <w:t>7d18e4322a7cfee3f535a62ebe39f329b46102d8fcc5cecb55e9781ea92720ce</w:t>
             </w:r>
           </w:p>
         </w:tc>
@@ -2098,7 +2098,7 @@
                 <w:rFonts w:ascii="Malgun Gothic" w:hAnsi="Malgun Gothic" w:eastAsia="맑은 고딕"/>
                 <w:sz w:val="16"/>
               </w:rPr>
-              <w:t>dc42c12a4380bb2e358469755daf59238ec864ac334d33666702962e1aa966ac</w:t>
+              <w:t>fcde18963245af8a3130e0dbeb35aeec5e2c2cf2f390e5eb1031ecb01c56b3c1</w:t>
             </w:r>
           </w:p>
         </w:tc>
@@ -2190,7 +2190,7 @@
                 <w:rFonts w:ascii="Malgun Gothic" w:hAnsi="Malgun Gothic" w:eastAsia="맑은 고딕"/>
                 <w:sz w:val="16"/>
               </w:rPr>
-              <w:t>d6efcea6ed08e0cccc0473452e13b4e30e248e3761f531938fa26b67e3310cd4</w:t>
+              <w:t>e442bbe9503c73845414875a4c4797df0676920d39911228581c39011f3b13e8</w:t>
             </w:r>
           </w:p>
         </w:tc>
@@ -2282,7 +2282,7 @@
                 <w:rFonts w:ascii="Malgun Gothic" w:hAnsi="Malgun Gothic" w:eastAsia="맑은 고딕"/>
                 <w:sz w:val="16"/>
               </w:rPr>
-              <w:t>0363a6f4fa2e4ec9befe431cea7a4357e927419bd29a41f73ca579da554274b2</w:t>
+              <w:t>47f23bfe929b1be1719ae90c6d857abc9d1ab0051e9f0e1904d113c79d0b9c93</w:t>
             </w:r>
           </w:p>
         </w:tc>
@@ -2374,7 +2374,7 @@
                 <w:rFonts w:ascii="Malgun Gothic" w:hAnsi="Malgun Gothic" w:eastAsia="맑은 고딕"/>
                 <w:sz w:val="16"/>
               </w:rPr>
-              <w:t>cf2b7aad0ff1a2a86bb53a8eaf2c42716a6071df974dd0070290b96d56ddf81e</w:t>
+              <w:t>40f9682c5b82ecad3ad96705cfdb0e7399c75e78a214d759635aa3e927585d92</w:t>
             </w:r>
           </w:p>
         </w:tc>
@@ -7285,7 +7285,7 @@
                 <w:rFonts w:ascii="Malgun Gothic" w:hAnsi="Malgun Gothic" w:eastAsia="맑은 고딕"/>
                 <w:sz w:val="16"/>
               </w:rPr>
-              <w:t>f4f066fdb8f1</w:t>
+              <w:t>87e4183b19ad</w:t>
             </w:r>
           </w:p>
         </w:tc>
@@ -7303,7 +7303,7 @@
                 <w:rFonts w:ascii="Malgun Gothic" w:hAnsi="Malgun Gothic" w:eastAsia="맑은 고딕"/>
                 <w:sz w:val="16"/>
               </w:rPr>
-              <w:t>a7bbbbdeb0dfdc6d</w:t>
+              <w:t>317e655198b751cf</w:t>
             </w:r>
           </w:p>
         </w:tc>
@@ -30197,7 +30197,7 @@
                 <w:rFonts w:ascii="Malgun Gothic" w:hAnsi="Malgun Gothic" w:eastAsia="맑은 고딕"/>
                 <w:sz w:val="16"/>
               </w:rPr>
-              <w:t>a37b0f4df6e9</w:t>
+              <w:t>464adefe585a</w:t>
             </w:r>
           </w:p>
         </w:tc>
@@ -30215,7 +30215,7 @@
                 <w:rFonts w:ascii="Malgun Gothic" w:hAnsi="Malgun Gothic" w:eastAsia="맑은 고딕"/>
                 <w:sz w:val="16"/>
               </w:rPr>
-              <w:t>ed1c0c065161676c</w:t>
+              <w:t>1280801e1eb9c092</w:t>
             </w:r>
           </w:p>
         </w:tc>

</xml_diff>